<commit_message>
Session 2: tooling, Serilog/exception-handling/Swagger, frontend libraries, shared layout
Backend: Serilog (console + rolling file), IExceptionHandler-based global
error handling returning a standard ApiResponse<T> envelope, real Swagger
UI via Swashbuckle (replacing the bare OpenAPI JSON template default).

Frontend: ESLint (angular-eslint + eslint-config-prettier), strict
TypeScript, fixed library set installed (Bootstrap, ng-bootstrap, CoreUI
free tier, ag-Grid Community, SweetAlert2, ngx-toastr, ng2-charts,
Bootstrap Icons), shared layout shell (core/layout/shell.ts) with the
hello-world content moved into features/home/home.ts.

Verified end-to-end in browser with both servers running, zero console
errors. Docs (CLAUDE.md, PROGRESS.md, plan doc) updated with decisions
made along the way: CoreUI CSS as the single base framework, ag-Grid's
new Theming API deferred to first real grid use, no routine spec-file
maintenance, multi-user + registration now in scope for Sessions 3-4.
</commit_message>
<xml_diff>
--- a/LifeOS_Development_Plan.docx
+++ b/LifeOS_Development_Plan.docx
@@ -3439,7 +3439,30 @@
         <w:ind w:left="360"/>
       </w:pPr>
       <w:r>
-        <w:t xml:space="preserve">Unit tests alongside components/services (Jasmine/Karma, Angular's default) for anything with real logic (progress calculations, streak logic, date aggregation) — not for pure templates.</w:t>
+        <w:rPr>
+          <w:b/>
+          <w:bCs/>
+        </w:rPr>
+        <w:t xml:space="preserve">No </w:t>
+      </w:r>
+      <w:r>
+        <w:rPr>
+          <w:rFonts w:ascii="Consolas" w:cs="Consolas" w:eastAsia="Consolas" w:hAnsi="Consolas"/>
+          <w:b/>
+          <w:bCs/>
+          <w:shd w:fill="EEEEEE" w:val="clear"/>
+        </w:rPr>
+        <w:t xml:space="preserve">.spec.ts</w:t>
+      </w:r>
+      <w:r>
+        <w:rPr>
+          <w:b/>
+          <w:bCs/>
+        </w:rPr>
+        <w:t xml:space="preserve"> maintenance as routine scaffolding</w:t>
+      </w:r>
+      <w:r>
+        <w:t xml:space="preserve"> (confirmed with you in Session 2) — tests only get written for components/services with real logic (progress calculations, streak logic, date aggregation), not for templates or thin wrappers.</w:t>
       </w:r>
     </w:p>
     <w:p>
@@ -4069,21 +4092,38 @@
         <w:tc>
           <w:p>
             <w:r>
-              <w:t xml:space="preserve">Tooling &amp; conventions</w:t>
-            </w:r>
-          </w:p>
-        </w:tc>
-        <w:tc>
-          <w:p>
-            <w:r>
-              <w:t xml:space="preserve">ESLint/Prettier/strict TS wired; Serilog wired; global exception-handling middleware; standard API response envelope; Swagger</w:t>
-            </w:r>
-          </w:p>
-        </w:tc>
-        <w:tc>
-          <w:p>
-            <w:r>
-              <w:t xml:space="preserve">Lint passes, a thrown exception returns a clean JSON error, Swagger UI loads</w:t>
+              <w:t xml:space="preserve">✅ Tooling &amp; conventions</w:t>
+            </w:r>
+          </w:p>
+        </w:tc>
+        <w:tc>
+          <w:p>
+            <w:r>
+              <w:t xml:space="preserve">ESLint/Prettier/strict TS wired; Serilog wired; global exception-handling middleware; standard API response envelope; Swagger; fixed frontend library set installed; shared layout shell built</w:t>
+            </w:r>
+          </w:p>
+        </w:tc>
+        <w:tc>
+          <w:p>
+            <w:r>
+              <w:rPr>
+                <w:b/>
+                <w:bCs/>
+              </w:rPr>
+              <w:t xml:space="preserve">Done</w:t>
+            </w:r>
+            <w:r>
+              <w:t xml:space="preserve"> — lint clean, build clean, thrown exception returns a clean </w:t>
+            </w:r>
+            <w:r>
+              <w:rPr>
+                <w:rFonts w:ascii="Consolas" w:cs="Consolas" w:eastAsia="Consolas" w:hAnsi="Consolas"/>
+                <w:shd w:fill="EEEEEE" w:val="clear"/>
+              </w:rPr>
+              <w:t xml:space="preserve">ApiResponse</w:t>
+            </w:r>
+            <w:r>
+              <w:t xml:space="preserve"> JSON error, Swagger UI loads, shell+Home verified rendering in browser with zero console errors</w:t>
             </w:r>
           </w:p>
         </w:tc>

</xml_diff>

<commit_message>
Session 4: auth - registration + login, JWT, LifeOS logo
Backend: IAuthService/AuthService (PasswordHasher<User>, result-pattern
for expected failures like duplicate email / bad password rather than
exceptions), IJwtTokenService, ICurrentUserService (reads JWT claims),
AuthController (register/login/me). JWT bearer auth wired in Program.cs
with a dev-only signing key in appsettings.Development.json.

Frontend: auth.service.ts (Signals-based session state, localStorage),
auth.interceptor.ts, auth.guard.ts, lazy-loaded login/register screens
(reactive forms, Bootstrap styling, ngx-toastr errors). Shell now shows
the logged-in user + a logout button.

Found and wired the actual LifeOS logo (LifeOS Connected Wellness
Emblem.png, previously unused in the root folder) as favicon + navbar
brand - distinct from the unrelated OkayToolsEIA4 project's own logo.

Verified the full cycle in a real browser: unauthenticated redirect,
registration, auto-login, logout, re-login - not just curl.
</commit_message>
<xml_diff>
--- a/LifeOS_Development_Plan.docx
+++ b/LifeOS_Development_Plan.docx
@@ -4378,7 +4378,7 @@
         <w:tc>
           <w:p>
             <w:r>
-              <w:t xml:space="preserve">Auth — login </w:t>
+              <w:t xml:space="preserve">✅ Auth — login </w:t>
             </w:r>
             <w:r>
               <w:rPr>
@@ -4442,7 +4442,24 @@
         <w:tc>
           <w:p>
             <w:r>
-              <w:t xml:space="preserve">Can register a new account, log in with it, hit a protected route, get rejected when logged out</w:t>
+              <w:rPr>
+                <w:b/>
+                <w:bCs/>
+              </w:rPr>
+              <w:t xml:space="preserve">Done</w:t>
+            </w:r>
+            <w:r>
+              <w:t xml:space="preserve"> — verified in a real browser: unauthenticated redirect to </w:t>
+            </w:r>
+            <w:r>
+              <w:rPr>
+                <w:rFonts w:ascii="Consolas" w:cs="Consolas" w:eastAsia="Consolas" w:hAnsi="Consolas"/>
+                <w:shd w:fill="EEEEEE" w:val="clear"/>
+              </w:rPr>
+              <w:t xml:space="preserve">/login</w:t>
+            </w:r>
+            <w:r>
+              <w:t xml:space="preserve">, registration → auto-login → home, logout → redirect, re-login — all confirmed working, not just curl-tested</w:t>
             </w:r>
           </w:p>
         </w:tc>

</xml_diff>